<commit_message>
docs(backlog): v26 maj (CL8, perf i18n, Codeberg leve, +151, +2 dettes), archive v25, gitignore verrous Word
</commit_message>
<xml_diff>
--- a/docs/backlogs/AnarBib-Backlog-2026-06-02-v26.docx
+++ b/docs/backlogs/AnarBib-Backlog-2026-06-02-v26.docx
@@ -95,7 +95,7 @@
           <w:color w:val="202020"/>
           <w:sz w:val="22"/>
         </w:rPr>
-        <w:t>Ce backlog v26 succède au v25 du 1er juin 2026. Il intègre la session du 2 juin 2026, consacrée à la gouvernance du corpus documentaire : adoption de la charte du corpus (CHARTE_corpus, en-tête standard à quatre champs et règle de préséance « référence avant trace ») ; création du registre des décisions (REGISTRE_decisions, foyer unique des arbitrages), enrichi des sections MULTI (multi-appartenance lectrice), PARTNER (partenariat stabilisé biblios) et des règles VALID-β1/γ1 ; figeage de la charpente spec-multi-appartenance-lecteur en v0.3 (cinq arbitrages soldés, audit Zone 23 intégré) ; arbitrage des six décisions D1-D6 du partenariat stabilisé sous mandat impératif du collectif ; tamponnage historique des deux cadrages gradués ; mise à jour d'INDEX et INVENTAIRE (renvoi du cadrage multi-appartenance corrigé). Le déploiement de la pile #CL.8 (C.5/C.6) et de cette session reste en attente du déblocage Codeberg (HTTP 504 sur le push vers main). La structure à douze macro-chantiers et la convention « rien ne sort sans trace » sont conservées intégralement. La suite de la journée a figé la charpente spec-partenariat-biblios en v0.3 (décisions D7 cycle de vie, D8 retrait du consentement, D9 granularité), arbitré le partage numérique #ILL-digital sous mandat BLMF (registre §19, ILL-1 à ILL-9 : périmètre matériel gris, demi-verrou ISBN, plafond de diffusion non-élargissable, cycle du fichier ponctuel sans copie, catalogage = libre de droits) et charpenté spec-flux-partage-numerique en v0.2 (figée côté conception) ; le cadrage #ILL-digital a reçu son tampon historique, INDEX, INVENTAIRE et le registre ont été raccordés.</w:t>
+        <w:t>Ce backlog v26 succède au v25 du 1er juin 2026. Il intègre la session du 2 juin 2026, consacrée à la gouvernance du corpus documentaire : adoption de la charte du corpus (CHARTE_corpus, en-tête standard à quatre champs et règle de préséance « référence avant trace ») ; création du registre des décisions (REGISTRE_decisions, foyer unique des arbitrages), enrichi des sections MULTI (multi-appartenance lectrice), PARTNER (partenariat stabilisé biblios) et des règles VALID-β1/γ1 ; figeage de la charpente spec-multi-appartenance-lecteur en v0.3 (cinq arbitrages soldés, audit Zone 23 intégré) ; arbitrage des six décisions D1-D6 du partenariat stabilisé sous mandat impératif du collectif ; tamponnage historique des deux cadrages gradués ; mise à jour d'INDEX et INVENTAIRE (renvoi du cadrage multi-appartenance corrigé). Le déploiement de la pile #CL.8 (C.5/C.6) est désormais effectué : Codeberg revenu après l'incident #2596, le push passé, Woodpecker #843 vert de bout en bout (migrations, Edge Functions, pages) ; les tests runtime C.5/C.6 sont validés et #CL.8 est clos. La structure à douze macro-chantiers et la convention « rien ne sort sans trace » sont conservées intégralement. La suite de la journée a figé la charpente spec-partenariat-biblios en v0.3 (décisions D7 cycle de vie, D8 retrait du consentement, D9 granularité), arbitré le partage numérique #ILL-digital sous mandat BLMF (registre §19, ILL-1 à ILL-9 : périmètre matériel gris, demi-verrou ISBN, plafond de diffusion non-élargissable, cycle du fichier ponctuel sans copie, catalogage = libre de droits) et charpenté spec-flux-partage-numerique en v0.2 (figée côté conception) ; le cadrage #ILL-digital a reçu son tampon historique, INDEX, INVENTAIRE et le registre ont été raccordés.</w:t>
       </w:r>
     </w:p>
     <w:p>
@@ -261,7 +261,7 @@
           <w:color w:val="202020"/>
           <w:sz w:val="22"/>
         </w:rPr>
-        <w:t>Le v25 du 1er juin régularisait la session #CL.8 (C.5/C.6) et l'hygiène du corpus specs/. La session du 2 juin 2026 est consacrée à la gouvernance documentaire et à la préparation de plusieurs specs. Premier fil, la gouvernance : adoption de la charte du corpus (CHARTE_corpus v0.1), qui pose l'en-tête standard à quatre champs (Genre, Statut, Décisions, Supersédé par) « voyageant avec le document », la règle de préséance (la couche référence prime sur la couche trace) et la règle « une vérité, un foyer ». Le registre des décisions (REGISTRE_decisions) devient le foyer unique des arbitrages ; il reçoit la section §17 MULTI (sept décisions multi-appartenance), la section §18 PARTNER (les six décisions du partenariat) et les règles VALID-β1 (ajout d'une appartenance conditionné à une validation déjà acquise) et VALID-γ1 (révocation sans cascade). Second fil, les specs : la charpente spec-multi-appartenance-lecteur est figée en v0.3 — ses cinq points ouverts (F.3 préférences de notification par biblio, D.1 même titre dans deux biblios, Zone 19 sélecteur mono-biblio, B.2 contexte courant, Zone 23 audit) sont soldés, et l'audit de cohérence avec la validation par-appartenance (β.1/γ.1) est intégré sans incompatibilité. Le cadrage du partenariat stabilisé est arbitré (D1-D6) sous mandat impératif du collectif, dont le critère directeur est l'irréprochabilité politique au sens anarchiste. Leur contenu ayant gradué au registre et dans la charpente, les deux cadrages reçoivent le tampon « document de travail — historique ». INDEX et INVENTAIRE sont mis à jour : la charpente multi-appartenance entre dans le corpus (famille #CL), et le renvoi fautif du cadrage multi-appartenance (« backlog v23 §A.1 ») est corrigé vers le document de décision dédié. Troisième fil, le cluster découverte lecteur : deux specs de cadrage issues de l'atelier RebAL du 20/05 — spec-catalogue-decouverte (page de résultats : facettes à compteurs, nuage de sujets, parcours) et spec-notice-autorite-enrichie (notice BookPage + autorité AuthorPage, avec l'horizon de l'Atelier autorités) — reçoivent l'en-tête standard et voient leurs décisions versées au registre (nouvelle section §20 OPAC, dont OPAC-W1 qui acte la wishlist serveur et supersède la reco local-first) ; leurs sous-tickets (#OPAC7-11, #AUT1-4, #ATELIER) sont inscrits au chantier #CATALOG-EXT, où le recadrage requalifie #OPAC2 et #OPAC3 en « déjà fait ». Le déploiement de l'ensemble — pile #CL.8 incluse — reste suspendu au déblocage de Codeberg (HTTP 504 sur le push vers main).</w:t>
+        <w:t>Le v25 du 1er juin régularisait la session #CL.8 (C.5/C.6) et l'hygiène du corpus specs/. La session du 2 juin 2026 est consacrée à la gouvernance documentaire et à la préparation de plusieurs specs. Premier fil, la gouvernance : adoption de la charte du corpus (CHARTE_corpus v0.1), qui pose l'en-tête standard à quatre champs (Genre, Statut, Décisions, Supersédé par) « voyageant avec le document », la règle de préséance (la couche référence prime sur la couche trace) et la règle « une vérité, un foyer ». Le registre des décisions (REGISTRE_decisions) devient le foyer unique des arbitrages ; il reçoit la section §17 MULTI (sept décisions multi-appartenance), la section §18 PARTNER (les six décisions du partenariat) et les règles VALID-β1 (ajout d'une appartenance conditionné à une validation déjà acquise) et VALID-γ1 (révocation sans cascade). Second fil, les specs : la charpente spec-multi-appartenance-lecteur est figée en v0.3 — ses cinq points ouverts (F.3 préférences de notification par biblio, D.1 même titre dans deux biblios, Zone 19 sélecteur mono-biblio, B.2 contexte courant, Zone 23 audit) sont soldés, et l'audit de cohérence avec la validation par-appartenance (β.1/γ.1) est intégré sans incompatibilité. Le cadrage du partenariat stabilisé est arbitré (D1-D6) sous mandat impératif du collectif, dont le critère directeur est l'irréprochabilité politique au sens anarchiste. Leur contenu ayant gradué au registre et dans la charpente, les deux cadrages reçoivent le tampon « document de travail — historique ». INDEX et INVENTAIRE sont mis à jour : la charpente multi-appartenance entre dans le corpus (famille #CL), et le renvoi fautif du cadrage multi-appartenance (« backlog v23 §A.1 ») est corrigé vers le document de décision dédié. Troisième fil, le cluster découverte lecteur : deux specs de cadrage issues de l'atelier RebAL du 20/05 — spec-catalogue-decouverte (page de résultats : facettes à compteurs, nuage de sujets, parcours) et spec-notice-autorite-enrichie (notice BookPage + autorité AuthorPage, avec l'horizon de l'Atelier autorités) — reçoivent l'en-tête standard et voient leurs décisions versées au registre (nouvelle section §20 OPAC, dont OPAC-W1 qui acte la wishlist serveur et supersède la reco local-first) ; leurs sous-tickets (#OPAC7-11, #AUT1-4, #ATELIER) sont inscrits au chantier #CATALOG-EXT, où le recadrage requalifie #OPAC2 et #OPAC3 en « déjà fait ». Le déploiement de l'ensemble — pile #CL.8 incluse — a été effectué après le retour de Codeberg (incident #2596, ~24 h) : push passé, Woodpecker #843 vert de bout en bout — migrations, Edge Functions, pages. Le montage de notify-event par Woodpecker valide au passage la doctrine de déploiement #110 v0.4.</w:t>
       </w:r>
     </w:p>
     <w:p>
@@ -938,7 +938,7 @@
                 <w:color w:val="202020"/>
                 <w:sz w:val="19"/>
               </w:rPr>
-              <w:t>🟠 EN COURS (8/10 livrés)</w:t>
+              <w:t>🟠 EN COURS (9/10 livrés)</w:t>
             </w:r>
           </w:p>
         </w:tc>
@@ -2060,7 +2060,7 @@
           <w:color w:val="202020"/>
           <w:sz w:val="22"/>
         </w:rPr>
-        <w:t>Le backlog v26 inscrit douze macro-chantiers actifs au tableau de la section B, auxquels s'ajoutent ~83 sous-tickets en annexe D. Les 26 items résolus passent en section E. La session du 2 juin a porté sur la gouvernance du corpus documentaire (charte, registre, charpentes multi-appartenance et partenariat) et a inscrit le cluster découverte lecteur (#OPAC7-11, #AUT1-4, #ATELIER, issu de l'atelier RebAL du 20/05) au chantier #CATALOG-EXT, avec ses décisions au registre §20 OPAC. Aucun sous-ticket préexistant n'a été clos ni son état d'implémentation modifié — hors requalification documentaire de #OPAC2/#OPAC3 en « déjà fait », alignée sur le registre.</w:t>
+        <w:t>Le backlog v26 inscrit douze macro-chantiers actifs au tableau de la section B, auxquels s'ajoutent ~83 sous-tickets en annexe D. Les 28 items résolus passent en section E. La session du 2 juin a porté sur la gouvernance du corpus documentaire (charte, registre, charpentes multi-appartenance et partenariat) et a inscrit le cluster découverte lecteur (#OPAC7-11, #AUT1-4, #ATELIER, issu de l'atelier RebAL du 20/05) au chantier #CATALOG-EXT, avec ses décisions au registre §20 OPAC. La reprise du 2-3 juin a profité du retour de Codeberg (incident #2596) : le push est passé et Woodpecker #843 a déployé l'ensemble (migrations, Edge Functions, pages), ce qui a permis de clore deux items — #CL.8 (C.5/C.6, validés en runtime) et le refactor performance i18n (lazy-load des locales) — désormais en section E. Côté annexe D, #151 (compteur AUTORIDADES) est inscrit à #CATALOG-EXT, tandis que #OPAC2/#OPAC3 restent requalifiés « déjà fait », alignés sur le registre.</w:t>
       </w:r>
     </w:p>
     <w:p>
@@ -2191,7 +2191,7 @@
           <w:color w:val="202020"/>
           <w:sz w:val="22"/>
         </w:rPr>
-        <w:t>Score 16 (CRITIQUE) • Statut 🟠 EN COURS (8/10 livrés)</w:t>
+        <w:t>Score 16 (CRITIQUE) • Statut 🟠 EN COURS (9/10 livrés)</w:t>
       </w:r>
     </w:p>
     <w:p>
@@ -2206,7 +2206,7 @@
           <w:color w:val="202020"/>
           <w:sz w:val="22"/>
         </w:rPr>
-        <w:t>Faire de conta.html un poste d'observation personnel sur le catalogue vivant, et non une simple page administrative. Dix sous-items répartis en trois sprints. Au 31/05/2026, huit livrés (#CL.1 à #CL.7 plus #CL.9, voir section E). Reste #CL.8 — en cours d'implémentation au 01/06 : backend (C.1a/C.2/C.1b) et frontend lectrice (C.3/C.4) en production, C.5 (suppression de masse) et C.6 (badge painel + migration des vues painel) committés en attente de déploiement (lock Codeberg), deux tests runtime restants avant clôture. Reste aussi #CL.10 (dépend spec-multi-appartenance).</w:t>
+        <w:t>Faire de conta.html un poste d'observation personnel sur le catalogue vivant, et non une simple page administrative. Dix sous-items répartis en trois sprints. Au 03/06/2026, neuf livrés (#CL.1 à #CL.7 plus #CL.9, et #CL.8 désormais clos — voir section E). #CL.8 « Maîtrise historique » a été déployé via Woodpecker #843 (migration cl8_painel_views_c6) : C.5 (suppression de masse) et C.6 (badge painel + migration des vues painel) sont en production, les deux tests runtime C.5/C.6 validés. Reste #CL.10 (infos pratiques de retrait, dépend spec-multi-appartenance).</w:t>
       </w:r>
     </w:p>
     <w:p>
@@ -3063,93 +3063,6 @@
                 <w:color w:val="202020"/>
                 <w:sz w:val="19"/>
               </w:rPr>
-              <w:t>#CL.8</w:t>
-            </w:r>
-          </w:p>
-        </w:tc>
-        <w:tc>
-          <w:tcPr>
-            <w:tcW w:type="dxa" w:w="4195"/>
-            <w:vAlign w:val="top"/>
-          </w:tcPr>
-          <w:p>
-            <w:r/>
-            <w:r>
-              <w:rPr>
-                <w:rFonts w:ascii="Calibri" w:hAnsi="Calibri"/>
-                <w:color w:val="202020"/>
-                <w:sz w:val="19"/>
-              </w:rPr>
-              <w:t>Maîtrise historique — C.5/C.6 committés, en attente de déploiement</w:t>
-            </w:r>
-          </w:p>
-        </w:tc>
-        <w:tc>
-          <w:tcPr>
-            <w:tcW w:type="dxa" w:w="567"/>
-            <w:vAlign w:val="top"/>
-          </w:tcPr>
-          <w:p>
-            <w:r/>
-            <w:r>
-              <w:rPr>
-                <w:rFonts w:ascii="Calibri" w:hAnsi="Calibri"/>
-                <w:color w:val="202020"/>
-                <w:sz w:val="19"/>
-              </w:rPr>
-              <w:t>14</w:t>
-            </w:r>
-          </w:p>
-        </w:tc>
-        <w:tc>
-          <w:tcPr>
-            <w:tcW w:type="dxa" w:w="1134"/>
-            <w:vAlign w:val="top"/>
-          </w:tcPr>
-          <w:p>
-            <w:r/>
-            <w:r>
-              <w:rPr>
-                <w:rFonts w:ascii="Calibri" w:hAnsi="Calibri"/>
-                <w:color w:val="202020"/>
-                <w:sz w:val="19"/>
-              </w:rPr>
-              <w:t>~1 session</w:t>
-            </w:r>
-          </w:p>
-        </w:tc>
-        <w:tc>
-          <w:tcPr>
-            <w:tcW w:type="dxa" w:w="1587"/>
-            <w:vAlign w:val="top"/>
-          </w:tcPr>
-          <w:p>
-            <w:r/>
-            <w:r>
-              <w:rPr>
-                <w:rFonts w:ascii="Calibri" w:hAnsi="Calibri"/>
-                <w:color w:val="202020"/>
-                <w:sz w:val="19"/>
-              </w:rPr>
-              <w:t>🟠 EN COURS</w:t>
-            </w:r>
-          </w:p>
-        </w:tc>
-      </w:tr>
-      <w:tr>
-        <w:tc>
-          <w:tcPr>
-            <w:tcW w:type="dxa" w:w="1814"/>
-            <w:vAlign w:val="top"/>
-          </w:tcPr>
-          <w:p>
-            <w:r/>
-            <w:r>
-              <w:rPr>
-                <w:rFonts w:ascii="Calibri" w:hAnsi="Calibri"/>
-                <w:color w:val="202020"/>
-                <w:sz w:val="19"/>
-              </w:rPr>
               <w:t>#CL.10</w:t>
             </w:r>
           </w:p>
@@ -8770,6 +8683,93 @@
           </w:p>
         </w:tc>
       </w:tr>
+      <w:tr>
+        <w:tc>
+          <w:tcPr>
+            <w:tcW w:type="dxa" w:w="1814"/>
+            <w:vAlign w:val="top"/>
+          </w:tcPr>
+          <w:p>
+            <w:r/>
+            <w:r>
+              <w:rPr>
+                <w:rFonts w:ascii="Calibri" w:hAnsi="Calibri"/>
+                <w:color w:val="202020"/>
+                <w:sz w:val="19"/>
+              </w:rPr>
+              <w:t>#151</w:t>
+            </w:r>
+          </w:p>
+        </w:tc>
+        <w:tc>
+          <w:tcPr>
+            <w:tcW w:type="dxa" w:w="4195"/>
+            <w:vAlign w:val="top"/>
+          </w:tcPr>
+          <w:p>
+            <w:r/>
+            <w:r>
+              <w:rPr>
+                <w:rFonts w:ascii="Calibri" w:hAnsi="Calibri"/>
+                <w:color w:val="202020"/>
+                <w:sz w:val="19"/>
+              </w:rPr>
+              <w:t>Compteur AUTORIDADES sur Biblioteca : à repenser réseau</w:t>
+            </w:r>
+          </w:p>
+        </w:tc>
+        <w:tc>
+          <w:tcPr>
+            <w:tcW w:type="dxa" w:w="567"/>
+            <w:vAlign w:val="top"/>
+          </w:tcPr>
+          <w:p>
+            <w:r/>
+            <w:r>
+              <w:rPr>
+                <w:rFonts w:ascii="Calibri" w:hAnsi="Calibri"/>
+                <w:color w:val="202020"/>
+                <w:sz w:val="19"/>
+              </w:rPr>
+              <w:t>6</w:t>
+            </w:r>
+          </w:p>
+        </w:tc>
+        <w:tc>
+          <w:tcPr>
+            <w:tcW w:type="dxa" w:w="1134"/>
+            <w:vAlign w:val="top"/>
+          </w:tcPr>
+          <w:p>
+            <w:r/>
+            <w:r>
+              <w:rPr>
+                <w:rFonts w:ascii="Calibri" w:hAnsi="Calibri"/>
+                <w:color w:val="202020"/>
+                <w:sz w:val="19"/>
+              </w:rPr>
+              <w:t>1-2h</w:t>
+            </w:r>
+          </w:p>
+        </w:tc>
+        <w:tc>
+          <w:tcPr>
+            <w:tcW w:type="dxa" w:w="1587"/>
+            <w:vAlign w:val="top"/>
+          </w:tcPr>
+          <w:p>
+            <w:r/>
+            <w:r>
+              <w:rPr>
+                <w:rFonts w:ascii="Calibri" w:hAnsi="Calibri"/>
+                <w:color w:val="202020"/>
+                <w:sz w:val="19"/>
+              </w:rPr>
+              <w:t>🟡 OUVERT</w:t>
+            </w:r>
+          </w:p>
+        </w:tc>
+      </w:tr>
     </w:tbl>
     <w:p>
       <w:pPr>
@@ -8796,6 +8796,30 @@
           <w:sz w:val="22"/>
         </w:rPr>
         <w:t>Inchangés du v23, voir backlog précédent pour le détail (≈ 38 sous-tickets dans ces six sous-clusters). Ajout au v25 — #HYG-rapports-consultas : les deux rapports hebdomadaires automatiques (Relatório semanal d'une bibliothèque et Relatório semanal da rede) couvrent réservations, emprunts, renouvellements, retours, retards et PEB mais omettent les consultations sur place. À ajouter : une section consultations dédiée (criadas / honradas / no-show / em curso + N dernières) dans les deux rapports, et une colonne consultations dans la Síntese por biblioteca du rapport réseau. Rang hygiène.</w:t>
+      </w:r>
+    </w:p>
+    <w:p>
+      <w:r>
+        <w:rPr>
+          <w:rFonts w:ascii="Calibri" w:hAnsi="Calibri"/>
+          <w:b w:val="0"/>
+          <w:i/>
+          <w:color w:val="202020"/>
+          <w:sz w:val="22"/>
+        </w:rPr>
+        <w:t>Ajout au v26 — #I18N-charte-inclusive : sept clés signalées non conformes à la charte d'écriture inclusive lors des tests runtime du 2-3 juin. Catalan non traduit sur account.loans.renew et biblioteca.title ; pt-BR en forme « (a) » au lieu de « (a/e) » sur reader.external.notice et solicitar.claim.invalid.body ; espagnol en « /a » ou « (a) » au lieu du e neutre sur privacy.s2.item.password, privacy.s7.honest et privacy.s7.measure.rls. À corriger en une passe (les 8 locales tenues ensemble) : mise en conformité de la forme inclusive et traduction des deux clés catalanes. Rang hygiène.</w:t>
+      </w:r>
+    </w:p>
+    <w:p>
+      <w:r>
+        <w:rPr>
+          <w:rFonts w:ascii="Calibri" w:hAnsi="Calibri"/>
+          <w:b w:val="0"/>
+          <w:i/>
+          <w:color w:val="202020"/>
+          <w:sz w:val="22"/>
+        </w:rPr>
+        <w:t>Ajout au v26 — #PERF-accountpage-split : après le lazy-load des locales (chunk index ramené de 1605 à 418 Ko, voir section E), AccountPage reste le seul chunk au-dessus du seuil de 500 Ko, à 602 Ko. Candidat à un découpage (React.lazy par onglet ou extraction des sous-vues), dans la continuité du chantier performance. Rang perf.</w:t>
       </w:r>
     </w:p>
     <w:p>
@@ -8830,7 +8854,7 @@
           <w:color w:val="202020"/>
           <w:sz w:val="22"/>
         </w:rPr>
-        <w:t>Items résolus en mai 2026 et précédemment maintenus dans le tableau actif par la convention « rien ne sort ». Le v24 a enrichi cette section de quatre clôtures du 31/05/2026 soir (audit du corpus specs/ livré, groupe A appliqué, groupe B appliqué, dette R7-R11 sur spec-flux-emprunts levée). Le v25 ajoute une entrée du 01/06/2026 : passe de correction de la doctrine de déploiement #110 (v0.4) et hygiène du corpus (INDEX/INVENTAIRE, README, clôture des six arbitrages de l'audit, Option D).</w:t>
+        <w:t>Items résolus en mai 2026 et précédemment maintenus dans le tableau actif par la convention « rien ne sort ». Le v24 a enrichi cette section de quatre clôtures du 31/05/2026 soir (audit du corpus specs/ livré, groupe A appliqué, groupe B appliqué, dette R7-R11 sur spec-flux-emprunts levée). Le v25 ajoute une entrée du 01/06/2026 : passe de correction de la doctrine de déploiement #110 (v0.4) et hygiène du corpus (INDEX/INVENTAIRE, README, clôture des six arbitrages de l'audit, Option D). Le v26 (reprise du 2-3 juin) ajoute deux clôtures, consécutives au retour de Codeberg et au déploiement Woodpecker #843 : #CL.8 (C.5/C.6 déployés, tests runtime validés) et le refactor performance i18n (lazy-load des locales, chunk index ramené de 1605 à 418 Ko).</w:t>
       </w:r>
     </w:p>
     <w:tbl>
@@ -8938,7 +8962,7 @@
                 <w:color w:val="202020"/>
                 <w:sz w:val="17"/>
               </w:rPr>
-              <w:t>01/06/2026</w:t>
+              <w:t>02-03/06/2026</w:t>
             </w:r>
           </w:p>
         </w:tc>
@@ -8955,7 +8979,7 @@
                 <w:color w:val="202020"/>
                 <w:sz w:val="17"/>
               </w:rPr>
-              <w:t>HYGIENE-SPECS-0106</w:t>
+              <w:t>#CL.8</w:t>
             </w:r>
           </w:p>
         </w:tc>
@@ -8972,7 +8996,7 @@
                 <w:color w:val="202020"/>
                 <w:sz w:val="17"/>
               </w:rPr>
-              <w:t>Passe doctrine déploiement #110 (v0.4) + hygiène corpus + clôture arbitrages (Option D)</w:t>
+              <w:t>Maîtrise historique — suppression de masse (C.5) + badge painel et migration des vues painel (C.6)</w:t>
             </w:r>
           </w:p>
         </w:tc>
@@ -8989,7 +9013,7 @@
                 <w:color w:val="202020"/>
                 <w:sz w:val="17"/>
               </w:rPr>
-              <w:t>Livré — correction de la doctrine de déploiement des Edge Functions dans spec-migration-mail-resend (v0.3 → v0.4, huit passages alignés sur le .woodpecker.yml : Woodpecker déploie toutes les EF au push via l'étape deploy-edge-functions, notify-event comprise ; verify_jwt porté par config.toml ; seul l'outil MCP deploy_edge_function proscrit). INDEX et INVENTAIRE actualisés (statut #CL.8 en cours, version #110 portée à v0.4). README nettoyé (724 backslashes parasites éliminés). Six arbitrages de l'audit specs tranchés (Option D : VII.1 socle migration-compte absorbé dans multi-appartenance ; VII.4 cartographie-reseau en attente RESEAU-FED ; VII.5 .md norme ; VII.2/3/6 déjà tranchés).</w:t>
+              <w:t>Livré — déployé via Woodpecker #843 (migration cl8_painel_views_c6, restitution de is_hidden_by_user dans les trois vues painel). C.5 (suppression de masse de l'historique côté lectrice) et C.6 (badge painel + migration des vues) en production ; les deux tests runtime C.5/C.6 validés. Clôt le méga-item #CL à 9/10 (reste #CL.10).</w:t>
             </w:r>
           </w:p>
         </w:tc>
@@ -9008,7 +9032,7 @@
                 <w:color w:val="202020"/>
                 <w:sz w:val="17"/>
               </w:rPr>
-              <w:t>31/05/2026 soir</w:t>
+              <w:t>02-03/06/2026</w:t>
             </w:r>
           </w:p>
         </w:tc>
@@ -9025,7 +9049,7 @@
                 <w:color w:val="202020"/>
                 <w:sz w:val="17"/>
               </w:rPr>
-              <w:t>AUDIT-SPECS-N1</w:t>
+              <w:t>#PERF-i18n-lazy</w:t>
             </w:r>
           </w:p>
         </w:tc>
@@ -9042,7 +9066,7 @@
                 <w:color w:val="202020"/>
                 <w:sz w:val="17"/>
               </w:rPr>
-              <w:t>Audit du corpus specs/ — niveau 1 (cartographique)</w:t>
+              <w:t>Lazy-load des locales i18n + retrait du visualizer</w:t>
             </w:r>
           </w:p>
         </w:tc>
@@ -9059,7 +9083,7 @@
                 <w:color w:val="202020"/>
                 <w:sz w:val="17"/>
               </w:rPr>
-              <w:t>Livré — docs/decisions/AnarBib_specs_audit_2026-05-31.docx. 22 specs vivantes inventoriées, neuf nouvelles depuis 20/05 cataloguées, sept écarts structurants identifiés, treize actions recommandées en trois groupes, six arbitrages à rendre. Sert de source aux deux commits de mise en œuvre du 31/05 soir (groupe A et groupe B).</w:t>
+              <w:t>Livré — les sept locales (fr, es, en, it, de, ca, eo) passées en import() dynamique, pt-BR conservée en repli statique synchrone ; chunk index ramené de 1605 à 418 Ko, sept chunks de langue séparés. rollup-plugin-visualizer désinstallé. Déployé via Woodpecker #843 (étape pages) sur app.anarbib.org, rendu validé. Dette résiduelle : AccountPage à 602 Ko (annexe D, #PERF-accountpage-split).</w:t>
             </w:r>
           </w:p>
         </w:tc>
@@ -9078,7 +9102,7 @@
                 <w:color w:val="202020"/>
                 <w:sz w:val="17"/>
               </w:rPr>
-              <w:t>31/05/2026 soir</w:t>
+              <w:t>01/06/2026</w:t>
             </w:r>
           </w:p>
         </w:tc>
@@ -9095,7 +9119,7 @@
                 <w:color w:val="202020"/>
                 <w:sz w:val="17"/>
               </w:rPr>
-              <w:t>AUDIT-SPECS-GA</w:t>
+              <w:t>HYGIENE-SPECS-0106</w:t>
             </w:r>
           </w:p>
         </w:tc>
@@ -9112,7 +9136,7 @@
                 <w:color w:val="202020"/>
                 <w:sz w:val="17"/>
               </w:rPr>
-              <w:t>Groupe A de l'audit appliqué — hygiène immédiate</w:t>
+              <w:t>Passe doctrine déploiement #110 (v0.4) + hygiène corpus + clôture arbitrages (Option D)</w:t>
             </w:r>
           </w:p>
         </w:tc>
@@ -9129,7 +9153,7 @@
                 <w:color w:val="202020"/>
                 <w:sz w:val="17"/>
               </w:rPr>
-              <w:t>Livré — trois amendements en blockquote sur les specs désynchronisées (workflow-reservation : « en prod depuis paquet 5b 09/05 » ; refactor-v3-semantique : « décision actée et appliquée au paquet 5b » ; implementation-114a : « chantier #114.A clos 14/05 ») ; archivage du doublon spec-cartographie-reseau.docx ; six fichiers de archive/ renommés à la convention spec-X-archive-vY.Z.md (gouvernance-roles, migration-compte, migration-mail-resend ×2, onboarding-criar-conta, validation-physique). Sept git mv + trois copies en un commit. Lève cinq des sept écarts identifiés à l'audit.</w:t>
+              <w:t>Livré — correction de la doctrine de déploiement des Edge Functions dans spec-migration-mail-resend (v0.3 → v0.4, huit passages alignés sur le .woodpecker.yml : Woodpecker déploie toutes les EF au push via l'étape deploy-edge-functions, notify-event comprise ; verify_jwt porté par config.toml ; seul l'outil MCP deploy_edge_function proscrit). INDEX et INVENTAIRE actualisés (statut #CL.8 en cours, version #110 portée à v0.4). README nettoyé (724 backslashes parasites éliminés). Six arbitrages de l'audit specs tranchés (Option D : VII.1 socle migration-compte absorbé dans multi-appartenance ; VII.4 cartographie-reseau en attente RESEAU-FED ; VII.5 .md norme ; VII.2/3/6 déjà tranchés).</w:t>
             </w:r>
           </w:p>
         </w:tc>
@@ -9165,7 +9189,7 @@
                 <w:color w:val="202020"/>
                 <w:sz w:val="17"/>
               </w:rPr>
-              <w:t>AUDIT-SPECS-GB</w:t>
+              <w:t>AUDIT-SPECS-N1</w:t>
             </w:r>
           </w:p>
         </w:tc>
@@ -9182,7 +9206,7 @@
                 <w:color w:val="202020"/>
                 <w:sz w:val="17"/>
               </w:rPr>
-              <w:t>Groupe B de l'audit appliqué — amendements ciblés</w:t>
+              <w:t>Audit du corpus specs/ — niveau 1 (cartographique)</w:t>
             </w:r>
           </w:p>
         </w:tc>
@@ -9199,7 +9223,7 @@
                 <w:color w:val="202020"/>
                 <w:sz w:val="17"/>
               </w:rPr>
-              <w:t>Livré — propagation des doctrines techniques R7-R11 du domaine consultas au domaine emprunts (spec-flux-emprunts v1 → v1.1, nouvelle section §11.3 de ~7 Ko avec adaptation par doctrine : R7 ordre UPDATE narrative-avant-état applicable aux RPC fn_v2_*, R8 distinction notes par acteur non applicable littéralement aujourd'hui mais à anticiper, R9 traçabilité coordination avec audit de cinq RPC, R10 cohérence handler-trigger illustrée par #NOTIFY-prorrogacao, R11 transverse). Refonte intégrale de INDEX.md (10 Ko) et INVENTAIRE.md (28 Ko) : inscription des neuf specs neuves, trois nouvelles familles documentaires (#CL compte lecteur, mode terrain, modélisation structurelle), carte des dépendances actualisée, section « Maintenance du corpus » obsolète supprimée, pattern « note de clôture en blockquote » inscrit comme convention officielle, versions désynchronisées corrigées (gouvernance-roles v1.1 → v1.3, validation-physique amendement 30/05, etc.).</w:t>
+              <w:t>Livré — docs/decisions/AnarBib_specs_audit_2026-05-31.docx. 22 specs vivantes inventoriées, neuf nouvelles depuis 20/05 cataloguées, sept écarts structurants identifiés, treize actions recommandées en trois groupes, six arbitrages à rendre. Sert de source aux deux commits de mise en œuvre du 31/05 soir (groupe A et groupe B).</w:t>
             </w:r>
           </w:p>
         </w:tc>
@@ -9235,7 +9259,7 @@
                 <w:color w:val="202020"/>
                 <w:sz w:val="17"/>
               </w:rPr>
-              <w:t>spec-flux-emprunts v1.1</w:t>
+              <w:t>AUDIT-SPECS-GA</w:t>
             </w:r>
           </w:p>
         </w:tc>
@@ -9252,7 +9276,7 @@
                 <w:color w:val="202020"/>
                 <w:sz w:val="17"/>
               </w:rPr>
-              <w:t>Dette doctrinale R7-R11 levée (signalée à l'INDEX depuis 11 jours)</w:t>
+              <w:t>Groupe A de l'audit appliqué — hygiène immédiate</w:t>
             </w:r>
           </w:p>
         </w:tc>
@@ -9269,7 +9293,7 @@
                 <w:color w:val="202020"/>
                 <w:sz w:val="17"/>
               </w:rPr>
-              <w:t>Levée à l'occasion du groupe B. La dette était inscrite explicitement à l'INDEX du 20/05 : « TODO : propagation des doctrines R7-R11 » sur la fiche spec-flux-emprunts. Onze jours après, la propagation est faite. Le TODO inscrit au §12 de spec-flux-consultations-v2.2 (« à mettre à jour ») est également levé symétriquement.</w:t>
+              <w:t>Livré — trois amendements en blockquote sur les specs désynchronisées (workflow-reservation : « en prod depuis paquet 5b 09/05 » ; refactor-v3-semantique : « décision actée et appliquée au paquet 5b » ; implementation-114a : « chantier #114.A clos 14/05 ») ; archivage du doublon spec-cartographie-reseau.docx ; six fichiers de archive/ renommés à la convention spec-X-archive-vY.Z.md (gouvernance-roles, migration-compte, migration-mail-resend ×2, onboarding-criar-conta, validation-physique). Sept git mv + trois copies en un commit. Lève cinq des sept écarts identifiés à l'audit.</w:t>
             </w:r>
           </w:p>
         </w:tc>
@@ -9288,7 +9312,7 @@
                 <w:color w:val="202020"/>
                 <w:sz w:val="17"/>
               </w:rPr>
-              <w:t>31/05/2026</w:t>
+              <w:t>31/05/2026 soir</w:t>
             </w:r>
           </w:p>
         </w:tc>
@@ -9305,7 +9329,7 @@
                 <w:color w:val="202020"/>
                 <w:sz w:val="17"/>
               </w:rPr>
-              <w:t>#CL.1</w:t>
+              <w:t>AUDIT-SPECS-GB</w:t>
             </w:r>
           </w:p>
         </w:tc>
@@ -9322,7 +9346,7 @@
                 <w:color w:val="202020"/>
                 <w:sz w:val="17"/>
               </w:rPr>
-              <w:t>BookAvailability — historique + dispo locale</w:t>
+              <w:t>Groupe B de l'audit appliqué — amendements ciblés</w:t>
             </w:r>
           </w:p>
         </w:tc>
@@ -9339,7 +9363,7 @@
                 <w:color w:val="202020"/>
                 <w:sz w:val="17"/>
               </w:rPr>
-              <w:t>Livré — composant + hook + intégrations, RPC fn_v2_book_session_availability existante, 7 clés × 8 locales.</w:t>
+              <w:t>Livré — propagation des doctrines techniques R7-R11 du domaine consultas au domaine emprunts (spec-flux-emprunts v1 → v1.1, nouvelle section §11.3 de ~7 Ko avec adaptation par doctrine : R7 ordre UPDATE narrative-avant-état applicable aux RPC fn_v2_*, R8 distinction notes par acteur non applicable littéralement aujourd'hui mais à anticiper, R9 traçabilité coordination avec audit de cinq RPC, R10 cohérence handler-trigger illustrée par #NOTIFY-prorrogacao, R11 transverse). Refonte intégrale de INDEX.md (10 Ko) et INVENTAIRE.md (28 Ko) : inscription des neuf specs neuves, trois nouvelles familles documentaires (#CL compte lecteur, mode terrain, modélisation structurelle), carte des dépendances actualisée, section « Maintenance du corpus » obsolète supprimée, pattern « note de clôture en blockquote » inscrit comme convention officielle, versions désynchronisées corrigées (gouvernance-roles v1.1 → v1.3, validation-physique amendement 30/05, etc.).</w:t>
             </w:r>
           </w:p>
         </w:tc>
@@ -9358,7 +9382,7 @@
                 <w:color w:val="202020"/>
                 <w:sz w:val="17"/>
               </w:rPr>
-              <w:t>31/05/2026</w:t>
+              <w:t>31/05/2026 soir</w:t>
             </w:r>
           </w:p>
         </w:tc>
@@ -9375,7 +9399,7 @@
                 <w:color w:val="202020"/>
                 <w:sz w:val="17"/>
               </w:rPr>
-              <w:t>#CL.6</w:t>
+              <w:t>spec-flux-emprunts v1.1</w:t>
             </w:r>
           </w:p>
         </w:tc>
@@ -9392,7 +9416,7 @@
                 <w:color w:val="202020"/>
                 <w:sz w:val="17"/>
               </w:rPr>
-              <w:t>Centre d'avis : archivage par ligne + vue archives</w:t>
+              <w:t>Dette doctrinale R7-R11 levée (signalée à l'INDEX depuis 11 jours)</w:t>
             </w:r>
           </w:p>
         </w:tc>
@@ -9409,7 +9433,7 @@
                 <w:color w:val="202020"/>
                 <w:sz w:val="17"/>
               </w:rPr>
-              <w:t>Livré — migration archived_at, RPC fn_archive/unarchive (doctrine v2), UI bascule active/archives, compteur unread, 5 clés × 8 locales.</w:t>
+              <w:t>Levée à l'occasion du groupe B. La dette était inscrite explicitement à l'INDEX du 20/05 : « TODO : propagation des doctrines R7-R11 » sur la fiche spec-flux-emprunts. Onze jours après, la propagation est faite. Le TODO inscrit au §12 de spec-flux-consultations-v2.2 (« à mettre à jour ») est également levé symétriquement.</w:t>
             </w:r>
           </w:p>
         </w:tc>
@@ -9445,7 +9469,7 @@
                 <w:color w:val="202020"/>
                 <w:sz w:val="17"/>
               </w:rPr>
-              <w:t>#CL.7</w:t>
+              <w:t>#CL.1</w:t>
             </w:r>
           </w:p>
         </w:tc>
@@ -9462,7 +9486,7 @@
                 <w:color w:val="202020"/>
                 <w:sz w:val="17"/>
               </w:rPr>
-              <w:t>Préférences notification lectrice + réplique in-app</w:t>
+              <w:t>BookAvailability — historique + dispo locale</w:t>
             </w:r>
           </w:p>
         </w:tc>
@@ -9479,7 +9503,7 @@
                 <w:color w:val="202020"/>
                 <w:sz w:val="17"/>
               </w:rPr>
-              <w:t>Livré — table user_notification_preferences (Scénario C), 2 RPC, 2 triggers in-app frères, respect flag biblio + préférence lectrice, doctrine Position 1, 10 clés × 8 locales.</w:t>
+              <w:t>Livré — composant + hook + intégrations, RPC fn_v2_book_session_availability existante, 7 clés × 8 locales.</w:t>
             </w:r>
           </w:p>
         </w:tc>
@@ -9515,7 +9539,7 @@
                 <w:color w:val="202020"/>
                 <w:sz w:val="17"/>
               </w:rPr>
-              <w:t>#CL.9</w:t>
+              <w:t>#CL.6</w:t>
             </w:r>
           </w:p>
         </w:tc>
@@ -9532,7 +9556,7 @@
                 <w:color w:val="202020"/>
                 <w:sz w:val="17"/>
               </w:rPr>
-              <w:t>Liste d'envies enrichie</w:t>
+              <w:t>Centre d'avis : archivage par ligne + vue archives</w:t>
             </w:r>
           </w:p>
         </w:tc>
@@ -9549,7 +9573,7 @@
                 <w:color w:val="202020"/>
                 <w:sz w:val="17"/>
               </w:rPr>
-              <w:t>Livré — BookAvailability sur wishlist, bouton « Reservar agora » conditionné, indicateur biblio.</w:t>
+              <w:t>Livré — migration archived_at, RPC fn_archive/unarchive (doctrine v2), UI bascule active/archives, compteur unread, 5 clés × 8 locales.</w:t>
             </w:r>
           </w:p>
         </w:tc>
@@ -9585,7 +9609,7 @@
                 <w:color w:val="202020"/>
                 <w:sz w:val="17"/>
               </w:rPr>
-              <w:t>spec-notifications-lecteur</w:t>
+              <w:t>#CL.7</w:t>
             </w:r>
           </w:p>
         </w:tc>
@@ -9602,7 +9626,7 @@
                 <w:color w:val="202020"/>
                 <w:sz w:val="17"/>
               </w:rPr>
-              <w:t>Doctrine notifications lectrice v1.0</w:t>
+              <w:t>Préférences notification lectrice + réplique in-app</w:t>
             </w:r>
           </w:p>
         </w:tc>
@@ -9619,7 +9643,7 @@
                 <w:color w:val="202020"/>
                 <w:sz w:val="17"/>
               </w:rPr>
-              <w:t>Livré — 319 lignes, doctrines A/B/C, taxonomie 6 familles, configurabilité Position 1, cartographie 13 triggers.</w:t>
+              <w:t>Livré — table user_notification_preferences (Scénario C), 2 RPC, 2 triggers in-app frères, respect flag biblio + préférence lectrice, doctrine Position 1, 10 clés × 8 locales.</w:t>
             </w:r>
           </w:p>
         </w:tc>
@@ -9655,7 +9679,7 @@
                 <w:color w:val="202020"/>
                 <w:sz w:val="17"/>
               </w:rPr>
-              <w:t>spec-historico-retencao-lectrice</w:t>
+              <w:t>#CL.9</w:t>
             </w:r>
           </w:p>
         </w:tc>
@@ -9672,7 +9696,7 @@
                 <w:color w:val="202020"/>
                 <w:sz w:val="17"/>
               </w:rPr>
-              <w:t>Doctrine rétention historique v1.0</w:t>
+              <w:t>Liste d'envies enrichie</w:t>
             </w:r>
           </w:p>
         </w:tc>
@@ -9689,7 +9713,7 @@
                 <w:color w:val="202020"/>
                 <w:sz w:val="17"/>
               </w:rPr>
-              <w:t>Livré — 761 lignes, 9 décisions D.1-D.9, modèle technique indicatif, UX 8 locales, traitement honnête des limites.</w:t>
+              <w:t>Livré — BookAvailability sur wishlist, bouton « Reservar agora » conditionné, indicateur biblio.</w:t>
             </w:r>
           </w:p>
         </w:tc>
@@ -9725,7 +9749,7 @@
                 <w:color w:val="202020"/>
                 <w:sz w:val="17"/>
               </w:rPr>
-              <w:t>CADRAGE_spec-multi-appartenance-lecteur</w:t>
+              <w:t>spec-notifications-lecteur</w:t>
             </w:r>
           </w:p>
         </w:tc>
@@ -9742,7 +9766,7 @@
                 <w:color w:val="202020"/>
                 <w:sz w:val="17"/>
               </w:rPr>
-              <w:t>Cadrage doctrinal complet</w:t>
+              <w:t>Doctrine notifications lectrice v1.0</w:t>
             </w:r>
           </w:p>
         </w:tc>
@@ -9759,7 +9783,7 @@
                 <w:color w:val="202020"/>
                 <w:sz w:val="17"/>
               </w:rPr>
-              <w:t>Livré — 751 lignes, 23 zones d'ombre traitées sur 8 clusters, 8 statuts d'appartenance, articulation spec-validation-physique.</w:t>
+              <w:t>Livré — 319 lignes, doctrines A/B/C, taxonomie 6 familles, configurabilité Position 1, cartographie 13 triggers.</w:t>
             </w:r>
           </w:p>
         </w:tc>
@@ -9795,7 +9819,7 @@
                 <w:color w:val="202020"/>
                 <w:sz w:val="17"/>
               </w:rPr>
-              <w:t>RGPD §7.1</w:t>
+              <w:t>spec-historico-retencao-lectrice</w:t>
             </w:r>
           </w:p>
         </w:tc>
@@ -9812,7 +9836,7 @@
                 <w:color w:val="202020"/>
                 <w:sz w:val="17"/>
               </w:rPr>
-              <w:t>Câblage e-mail préavis purge bout en bout</w:t>
+              <w:t>Doctrine rétention historique v1.0</w:t>
             </w:r>
           </w:p>
         </w:tc>
@@ -9829,7 +9853,7 @@
                 <w:color w:val="202020"/>
                 <w:sz w:val="17"/>
               </w:rPr>
-              <w:t>Livré — phase SQL + EF + 8 clés × 8 locales, test runtime validé (HTTP 200, mail Resend reçu).</w:t>
+              <w:t>Livré — 761 lignes, 9 décisions D.1-D.9, modèle technique indicatif, UX 8 locales, traitement honnête des limites.</w:t>
             </w:r>
           </w:p>
         </w:tc>
@@ -9848,7 +9872,7 @@
                 <w:color w:val="202020"/>
                 <w:sz w:val="17"/>
               </w:rPr>
-              <w:t>30/05/2026</w:t>
+              <w:t>31/05/2026</w:t>
             </w:r>
           </w:p>
         </w:tc>
@@ -9865,7 +9889,7 @@
                 <w:color w:val="202020"/>
                 <w:sz w:val="17"/>
               </w:rPr>
-              <w:t>#PAINEL — BOUCLÉ</w:t>
+              <w:t>CADRAGE_spec-multi-appartenance-lecteur</w:t>
             </w:r>
           </w:p>
         </w:tc>
@@ -9882,7 +9906,7 @@
                 <w:color w:val="202020"/>
                 <w:sz w:val="17"/>
               </w:rPr>
-              <w:t>Chantier-cadre Painel clos</w:t>
+              <w:t>Cadrage doctrinal complet</w:t>
             </w:r>
           </w:p>
         </w:tc>
@@ -9899,7 +9923,7 @@
                 <w:color w:val="202020"/>
                 <w:sz w:val="17"/>
               </w:rPr>
-              <w:t>Ouvert 26/05, clos 30/05. Tous EA-01 à EA-14 et OT-1/2/4 traités. Restes hors chantier : EA-02 → #MOBILE P3 ; EA-01 volet 3 → cadrage distinct.</w:t>
+              <w:t>Livré — 751 lignes, 23 zones d'ombre traitées sur 8 clusters, 8 statuts d'appartenance, articulation spec-validation-physique.</w:t>
             </w:r>
           </w:p>
         </w:tc>
@@ -9918,7 +9942,7 @@
                 <w:color w:val="202020"/>
                 <w:sz w:val="17"/>
               </w:rPr>
-              <w:t>30/05/2026</w:t>
+              <w:t>31/05/2026</w:t>
             </w:r>
           </w:p>
         </w:tc>
@@ -9935,7 +9959,7 @@
                 <w:color w:val="202020"/>
                 <w:sz w:val="17"/>
               </w:rPr>
-              <w:t>#PAINEL #115</w:t>
+              <w:t>RGPD §7.1</w:t>
             </w:r>
           </w:p>
         </w:tc>
@@ -9952,7 +9976,7 @@
                 <w:color w:val="202020"/>
                 <w:sz w:val="17"/>
               </w:rPr>
-              <w:t>Code-split des onglets</w:t>
+              <w:t>Câblage e-mail préavis purge bout en bout</w:t>
             </w:r>
           </w:p>
         </w:tc>
@@ -9969,7 +9993,7 @@
                 <w:color w:val="202020"/>
                 <w:sz w:val="17"/>
               </w:rPr>
-              <w:t>React.lazy + Suspense sur les 7 onglets de détail.</w:t>
+              <w:t>Livré — phase SQL + EF + 8 clés × 8 locales, test runtime validé (HTTP 200, mail Resend reçu).</w:t>
             </w:r>
           </w:p>
         </w:tc>
@@ -10005,7 +10029,7 @@
                 <w:color w:val="202020"/>
                 <w:sz w:val="17"/>
               </w:rPr>
-              <w:t>#PAINEL EA-01</w:t>
+              <w:t>#PAINEL — BOUCLÉ</w:t>
             </w:r>
           </w:p>
         </w:tc>
@@ -10022,7 +10046,7 @@
                 <w:color w:val="202020"/>
                 <w:sz w:val="17"/>
               </w:rPr>
-              <w:t>Porte d'entrée Trabalho do dia (volets 1+2)</w:t>
+              <w:t>Chantier-cadre Painel clos</w:t>
             </w:r>
           </w:p>
         </w:tc>
@@ -10039,7 +10063,7 @@
                 <w:color w:val="202020"/>
                 <w:sz w:val="17"/>
               </w:rPr>
-              <w:t>Porte d'entrée tâche ratifiée + séparateur. Volet 3 reporté.</w:t>
+              <w:t>Ouvert 26/05, clos 30/05. Tous EA-01 à EA-14 et OT-1/2/4 traités. Restes hors chantier : EA-02 → #MOBILE P3 ; EA-01 volet 3 → cadrage distinct.</w:t>
             </w:r>
           </w:p>
         </w:tc>
@@ -10075,7 +10099,7 @@
                 <w:color w:val="202020"/>
                 <w:sz w:val="17"/>
               </w:rPr>
-              <w:t>#PAINEL E.5</w:t>
+              <w:t>#PAINEL #115</w:t>
             </w:r>
           </w:p>
         </w:tc>
@@ -10092,7 +10116,7 @@
                 <w:color w:val="202020"/>
                 <w:sz w:val="17"/>
               </w:rPr>
-              <w:t>Remontée d'état fine par domaine</w:t>
+              <w:t>Code-split des onglets</w:t>
             </w:r>
           </w:p>
         </w:tc>
@@ -10109,7 +10133,7 @@
                 <w:color w:val="202020"/>
                 <w:sz w:val="17"/>
               </w:rPr>
-              <w:t>loadData éclaté en loadReservas/loadConsultas/loadLoans + loadTasks (résout EA-14).</w:t>
+              <w:t>React.lazy + Suspense sur les 7 onglets de détail.</w:t>
             </w:r>
           </w:p>
         </w:tc>
@@ -10145,7 +10169,7 @@
                 <w:color w:val="202020"/>
                 <w:sz w:val="17"/>
               </w:rPr>
-              <w:t>#PAINEL E.4</w:t>
+              <w:t>#PAINEL EA-01</w:t>
             </w:r>
           </w:p>
         </w:tc>
@@ -10162,7 +10186,7 @@
                 <w:color w:val="202020"/>
                 <w:sz w:val="17"/>
               </w:rPr>
-              <w:t>Styles inline → CSS (OT-2)</w:t>
+              <w:t>Porte d'entrée Trabalho do dia (volets 1+2)</w:t>
             </w:r>
           </w:p>
         </w:tc>
@@ -10179,7 +10203,7 @@
                 <w:color w:val="202020"/>
                 <w:sz w:val="17"/>
               </w:rPr>
-              <w:t>10/10 fichiers migrés vers PanelPage.css.</w:t>
+              <w:t>Porte d'entrée tâche ratifiée + séparateur. Volet 3 reporté.</w:t>
             </w:r>
           </w:p>
         </w:tc>
@@ -10215,7 +10239,7 @@
                 <w:color w:val="202020"/>
                 <w:sz w:val="17"/>
               </w:rPr>
-              <w:t>#PAINEL EA-03/11/14</w:t>
+              <w:t>#PAINEL E.5</w:t>
             </w:r>
           </w:p>
         </w:tc>
@@ -10232,7 +10256,7 @@
                 <w:color w:val="202020"/>
                 <w:sz w:val="17"/>
               </w:rPr>
-              <w:t>Cosmétiques résiduels</w:t>
+              <w:t>Remontée d'état fine par domaine</w:t>
             </w:r>
           </w:p>
         </w:tc>
@@ -10249,7 +10273,7 @@
                 <w:color w:val="202020"/>
                 <w:sz w:val="17"/>
               </w:rPr>
-              <w:t>EA-11 sélecteur taille de page ; EA-03 preview 2-phases ; EA-14 via E.5.</w:t>
+              <w:t>loadData éclaté en loadReservas/loadConsultas/loadLoans + loadTasks (résout EA-14).</w:t>
             </w:r>
           </w:p>
         </w:tc>
@@ -10285,7 +10309,7 @@
                 <w:color w:val="202020"/>
                 <w:sz w:val="17"/>
               </w:rPr>
-              <w:t>#PN-2</w:t>
+              <w:t>#PAINEL E.4</w:t>
             </w:r>
           </w:p>
         </w:tc>
@@ -10302,7 +10326,7 @@
                 <w:color w:val="202020"/>
                 <w:sz w:val="17"/>
               </w:rPr>
-              <w:t>404 manifeste de thème</w:t>
+              <w:t>Styles inline → CSS (OT-2)</w:t>
             </w:r>
           </w:p>
         </w:tc>
@@ -10319,7 +10343,7 @@
                 <w:color w:val="202020"/>
                 <w:sz w:val="17"/>
               </w:rPr>
-              <w:t>Résolu — colonne libraries.theme_slug + résolution connecté/anon + synchro upload/suppression.</w:t>
+              <w:t>10/10 fichiers migrés vers PanelPage.css.</w:t>
             </w:r>
           </w:p>
         </w:tc>
@@ -10338,7 +10362,7 @@
                 <w:color w:val="202020"/>
                 <w:sz w:val="17"/>
               </w:rPr>
-              <w:t>28/05/2026</w:t>
+              <w:t>30/05/2026</w:t>
             </w:r>
           </w:p>
         </w:tc>
@@ -10355,7 +10379,7 @@
                 <w:color w:val="202020"/>
                 <w:sz w:val="17"/>
               </w:rPr>
-              <w:t>#PAINEL E.1</w:t>
+              <w:t>#PAINEL EA-03/11/14</w:t>
             </w:r>
           </w:p>
         </w:tc>
@@ -10372,7 +10396,7 @@
                 <w:color w:val="202020"/>
                 <w:sz w:val="17"/>
               </w:rPr>
-              <w:t>Découpe iso-comportement PanelPage.jsx</w:t>
+              <w:t>Cosmétiques résiduels</w:t>
             </w:r>
           </w:p>
         </w:tc>
@@ -10389,7 +10413,7 @@
                 <w:color w:val="202020"/>
                 <w:sz w:val="17"/>
               </w:rPr>
-              <w:t>Clos — 3128 → 1870 lignes (−40%), 9 composants Tab*.jsx.</w:t>
+              <w:t>EA-11 sélecteur taille de page ; EA-03 preview 2-phases ; EA-14 via E.5.</w:t>
             </w:r>
           </w:p>
         </w:tc>
@@ -10408,7 +10432,7 @@
                 <w:color w:val="202020"/>
                 <w:sz w:val="17"/>
               </w:rPr>
-              <w:t>28/05/2026</w:t>
+              <w:t>30/05/2026</w:t>
             </w:r>
           </w:p>
         </w:tc>
@@ -10425,7 +10449,7 @@
                 <w:color w:val="202020"/>
                 <w:sz w:val="17"/>
               </w:rPr>
-              <w:t>#PAINEL E.2 v0</w:t>
+              <w:t>#PN-2</w:t>
             </w:r>
           </w:p>
         </w:tc>
@@ -10442,7 +10466,7 @@
                 <w:color w:val="202020"/>
                 <w:sz w:val="17"/>
               </w:rPr>
-              <w:t>Bouton refresh par onglet via TabHeader</w:t>
+              <w:t>404 manifeste de thème</w:t>
             </w:r>
           </w:p>
         </w:tc>
@@ -10459,7 +10483,7 @@
                 <w:color w:val="202020"/>
                 <w:sz w:val="17"/>
               </w:rPr>
-              <w:t>Clos — composant TabHeader mutualisé.</w:t>
+              <w:t>Résolu — colonne libraries.theme_slug + résolution connecté/anon + synchro upload/suppression.</w:t>
             </w:r>
           </w:p>
         </w:tc>
@@ -10495,7 +10519,7 @@
                 <w:color w:val="202020"/>
                 <w:sz w:val="17"/>
               </w:rPr>
-              <w:t>#PAINEL D</w:t>
+              <w:t>#PAINEL E.1</w:t>
             </w:r>
           </w:p>
         </w:tc>
@@ -10512,7 +10536,7 @@
                 <w:color w:val="202020"/>
                 <w:sz w:val="17"/>
               </w:rPr>
-              <w:t>Doctrine restriction mixte</w:t>
+              <w:t>Découpe iso-comportement PanelPage.jsx</w:t>
             </w:r>
           </w:p>
         </w:tc>
@@ -10529,7 +10553,7 @@
                 <w:color w:val="202020"/>
                 <w:sz w:val="17"/>
               </w:rPr>
-              <w:t>Clos — RPC restrict_member + freeze_account.</w:t>
+              <w:t>Clos — 3128 → 1870 lignes (−40%), 9 composants Tab*.jsx.</w:t>
             </w:r>
           </w:p>
         </w:tc>
@@ -10565,7 +10589,7 @@
                 <w:color w:val="202020"/>
                 <w:sz w:val="17"/>
               </w:rPr>
-              <w:t>#CARTE-LECTEUR β</w:t>
+              <w:t>#PAINEL E.2 v0</w:t>
             </w:r>
           </w:p>
         </w:tc>
@@ -10582,7 +10606,7 @@
                 <w:color w:val="202020"/>
                 <w:sz w:val="17"/>
               </w:rPr>
-              <w:t>Carte-lecteur — phase β</w:t>
+              <w:t>Bouton refresh par onglet via TabHeader</w:t>
             </w:r>
           </w:p>
         </w:tc>
@@ -10599,7 +10623,7 @@
                 <w:color w:val="202020"/>
                 <w:sz w:val="17"/>
               </w:rPr>
-              <w:t>Livré en production. Mini-table reader_card_tokens, RPC SECURITY DEFINER REVOKE-é, QR opaque anti-tracking.</w:t>
+              <w:t>Clos — composant TabHeader mutualisé.</w:t>
             </w:r>
           </w:p>
         </w:tc>
@@ -10618,7 +10642,7 @@
                 <w:color w:val="202020"/>
                 <w:sz w:val="17"/>
               </w:rPr>
-              <w:t>27-28/05/2026</w:t>
+              <w:t>28/05/2026</w:t>
             </w:r>
           </w:p>
         </w:tc>
@@ -10635,7 +10659,7 @@
                 <w:color w:val="202020"/>
                 <w:sz w:val="17"/>
               </w:rPr>
-              <w:t>#PAINEL B (EA-04, EA-08)</w:t>
+              <w:t>#PAINEL D</w:t>
             </w:r>
           </w:p>
         </w:tc>
@@ -10652,7 +10676,7 @@
                 <w:color w:val="202020"/>
                 <w:sz w:val="17"/>
               </w:rPr>
-              <w:t>Défense filtre actif + tri/filtre emprunts groupés</w:t>
+              <w:t>Doctrine restriction mixte</w:t>
             </w:r>
           </w:p>
         </w:tc>
@@ -10669,7 +10693,7 @@
                 <w:color w:val="202020"/>
                 <w:sz w:val="17"/>
               </w:rPr>
-              <w:t>Clos — déployé production nuit 27-28/05.</w:t>
+              <w:t>Clos — RPC restrict_member + freeze_account.</w:t>
             </w:r>
           </w:p>
         </w:tc>
@@ -10688,7 +10712,7 @@
                 <w:color w:val="202020"/>
                 <w:sz w:val="17"/>
               </w:rPr>
-              <w:t>27/05/2026</w:t>
+              <w:t>28/05/2026</w:t>
             </w:r>
           </w:p>
         </w:tc>
@@ -10705,7 +10729,7 @@
                 <w:color w:val="202020"/>
                 <w:sz w:val="17"/>
               </w:rPr>
-              <w:t>#PAINEL F (EA-06)</w:t>
+              <w:t>#CARTE-LECTEUR β</w:t>
             </w:r>
           </w:p>
         </w:tc>
@@ -10722,7 +10746,7 @@
                 <w:color w:val="202020"/>
                 <w:sz w:val="17"/>
               </w:rPr>
-              <w:t>Inscription doctrine item_status / workflow_stage</w:t>
+              <w:t>Carte-lecteur — phase β</w:t>
             </w:r>
           </w:p>
         </w:tc>
@@ -10739,7 +10763,7 @@
                 <w:color w:val="202020"/>
                 <w:sz w:val="17"/>
               </w:rPr>
-              <w:t>Clos — chapitre 0 du GLB v17.</w:t>
+              <w:t>Livré en production. Mini-table reader_card_tokens, RPC SECURITY DEFINER REVOKE-é, QR opaque anti-tracking.</w:t>
             </w:r>
           </w:p>
         </w:tc>
@@ -10758,7 +10782,7 @@
                 <w:color w:val="202020"/>
                 <w:sz w:val="17"/>
               </w:rPr>
-              <w:t>27/05/2026</w:t>
+              <w:t>27-28/05/2026</w:t>
             </w:r>
           </w:p>
         </w:tc>
@@ -10775,7 +10799,7 @@
                 <w:color w:val="202020"/>
                 <w:sz w:val="17"/>
               </w:rPr>
-              <w:t>#PN-1</w:t>
+              <w:t>#PAINEL B (EA-04, EA-08)</w:t>
             </w:r>
           </w:p>
         </w:tc>
@@ -10792,7 +10816,7 @@
                 <w:color w:val="202020"/>
                 <w:sz w:val="17"/>
               </w:rPr>
-              <w:t>Unifier helpers traduction d'erreur</w:t>
+              <w:t>Défense filtre actif + tri/filtre emprunts groupés</w:t>
             </w:r>
           </w:p>
         </w:tc>
@@ -10809,7 +10833,7 @@
                 <w:color w:val="202020"/>
                 <w:sz w:val="17"/>
               </w:rPr>
-              <w:t>Résolu — localizeError.js v3, 10 tests unitaires.</w:t>
+              <w:t>Clos — déployé production nuit 27-28/05.</w:t>
             </w:r>
           </w:p>
         </w:tc>
@@ -10845,7 +10869,7 @@
                 <w:color w:val="202020"/>
                 <w:sz w:val="17"/>
               </w:rPr>
-              <w:t>#153.E</w:t>
+              <w:t>#PAINEL F (EA-06)</w:t>
             </w:r>
           </w:p>
         </w:tc>
@@ -10862,7 +10886,7 @@
                 <w:color w:val="202020"/>
                 <w:sz w:val="17"/>
               </w:rPr>
-              <w:t>Lot de cohérence transverse des mails</w:t>
+              <w:t>Inscription doctrine item_status / workflow_stage</w:t>
             </w:r>
           </w:p>
         </w:tc>
@@ -10879,7 +10903,7 @@
                 <w:color w:val="202020"/>
                 <w:sz w:val="17"/>
               </w:rPr>
-              <w:t>Clos sur 7 constats. 2 détails de finition restent.</w:t>
+              <w:t>Clos — chapitre 0 du GLB v17.</w:t>
             </w:r>
           </w:p>
         </w:tc>
@@ -10915,7 +10939,7 @@
                 <w:color w:val="202020"/>
                 <w:sz w:val="17"/>
               </w:rPr>
-              <w:t>#153.C</w:t>
+              <w:t>#PN-1</w:t>
             </w:r>
           </w:p>
         </w:tc>
@@ -10932,7 +10956,7 @@
                 <w:color w:val="202020"/>
                 <w:sz w:val="17"/>
               </w:rPr>
-              <w:t>Logos résolus depuis le contexte</w:t>
+              <w:t>Unifier helpers traduction d'erreur</w:t>
             </w:r>
           </w:p>
         </w:tc>
@@ -10949,7 +10973,7 @@
                 <w:color w:val="202020"/>
                 <w:sz w:val="17"/>
               </w:rPr>
-              <w:t>Clos — colonne libraries.logo_url ajoutée.</w:t>
+              <w:t>Résolu — localizeError.js v3, 10 tests unitaires.</w:t>
             </w:r>
           </w:p>
         </w:tc>
@@ -10968,7 +10992,7 @@
                 <w:color w:val="202020"/>
                 <w:sz w:val="17"/>
               </w:rPr>
-              <w:t>26-27/05/2026</w:t>
+              <w:t>27/05/2026</w:t>
             </w:r>
           </w:p>
         </w:tc>
@@ -10985,7 +11009,7 @@
                 <w:color w:val="202020"/>
                 <w:sz w:val="17"/>
               </w:rPr>
-              <w:t>#PAINEL A (EA-05, EA-09, EA-13)</w:t>
+              <w:t>#153.E</w:t>
             </w:r>
           </w:p>
         </w:tc>
@@ -11002,7 +11026,7 @@
                 <w:color w:val="202020"/>
                 <w:sz w:val="17"/>
               </w:rPr>
-              <w:t>Harmonisation messages d'erreur + terminologie</w:t>
+              <w:t>Lot de cohérence transverse des mails</w:t>
             </w:r>
           </w:p>
         </w:tc>
@@ -11019,7 +11043,7 @@
                 <w:color w:val="202020"/>
                 <w:sz w:val="17"/>
               </w:rPr>
-              <w:t>Clos — 67 setMsg unifiés, emprestimo_id masqué côté lecteur, 5 clés × 8 locales.</w:t>
+              <w:t>Clos sur 7 constats. 2 détails de finition restent.</w:t>
             </w:r>
           </w:p>
         </w:tc>
@@ -11038,7 +11062,7 @@
                 <w:color w:val="202020"/>
                 <w:sz w:val="17"/>
               </w:rPr>
-              <w:t>26-27/05/2026</w:t>
+              <w:t>27/05/2026</w:t>
             </w:r>
           </w:p>
         </w:tc>
@@ -11055,7 +11079,7 @@
                 <w:color w:val="202020"/>
                 <w:sz w:val="17"/>
               </w:rPr>
-              <w:t>#153.D</w:t>
+              <w:t>#153.C</w:t>
             </w:r>
           </w:p>
         </w:tc>
@@ -11072,7 +11096,7 @@
                 <w:color w:val="202020"/>
                 <w:sz w:val="17"/>
               </w:rPr>
-              <w:t>Wording des mails de statut de réservation</w:t>
+              <w:t>Logos résolus depuis le contexte</w:t>
             </w:r>
           </w:p>
         </w:tc>
@@ -11089,7 +11113,7 @@
                 <w:color w:val="202020"/>
                 <w:sz w:val="17"/>
               </w:rPr>
-              <w:t>Clos — 12 clés refondues, écriture i18n inclusive sur 8 locales.</w:t>
+              <w:t>Clos — colonne libraries.logo_url ajoutée.</w:t>
             </w:r>
           </w:p>
         </w:tc>
@@ -11108,7 +11132,7 @@
                 <w:color w:val="202020"/>
                 <w:sz w:val="17"/>
               </w:rPr>
-              <w:t>26/05/2026</w:t>
+              <w:t>26-27/05/2026</w:t>
             </w:r>
           </w:p>
         </w:tc>
@@ -11125,7 +11149,7 @@
                 <w:color w:val="202020"/>
                 <w:sz w:val="17"/>
               </w:rPr>
-              <w:t>BUG_resa_terminale</w:t>
+              <w:t>#PAINEL A (EA-05, EA-09, EA-13)</w:t>
             </w:r>
           </w:p>
         </w:tc>
@@ -11142,7 +11166,7 @@
                 <w:color w:val="202020"/>
                 <w:sz w:val="17"/>
               </w:rPr>
-              <w:t>Réservation terminale classée active</w:t>
+              <w:t>Harmonisation messages d'erreur + terminologie</w:t>
             </w:r>
           </w:p>
         </w:tc>
@@ -11159,7 +11183,7 @@
                 <w:color w:val="202020"/>
                 <w:sz w:val="17"/>
               </w:rPr>
-              <w:t>Corrigé — migration 20260526010000.</w:t>
+              <w:t>Clos — 67 setMsg unifiés, emprestimo_id masqué côté lecteur, 5 clés × 8 locales.</w:t>
             </w:r>
           </w:p>
         </w:tc>
@@ -11178,7 +11202,7 @@
                 <w:color w:val="202020"/>
                 <w:sz w:val="17"/>
               </w:rPr>
-              <w:t>24-25/05/2026</w:t>
+              <w:t>26-27/05/2026</w:t>
             </w:r>
           </w:p>
         </w:tc>
@@ -11195,7 +11219,7 @@
                 <w:color w:val="202020"/>
                 <w:sz w:val="17"/>
               </w:rPr>
-              <w:t>#PARTNERS</w:t>
+              <w:t>#153.D</w:t>
             </w:r>
           </w:p>
         </w:tc>
@@ -11212,7 +11236,7 @@
                 <w:color w:val="202020"/>
                 <w:sz w:val="17"/>
               </w:rPr>
-              <w:t>Partenaires de correspondance d'une bibliothèque</w:t>
+              <w:t>Wording des mails de statut de réservation</w:t>
             </w:r>
           </w:p>
         </w:tc>
@@ -11229,7 +11253,7 @@
                 <w:color w:val="202020"/>
                 <w:sz w:val="17"/>
               </w:rPr>
-              <w:t>Livré — migration 20260524120000, composant LibraryPartnershipsSection, 18 clés × 8 langues.</w:t>
+              <w:t>Clos — 12 clés refondues, écriture i18n inclusive sur 8 locales.</w:t>
             </w:r>
           </w:p>
         </w:tc>
@@ -11248,7 +11272,7 @@
                 <w:color w:val="202020"/>
                 <w:sz w:val="17"/>
               </w:rPr>
-              <w:t>22-25/05/2026</w:t>
+              <w:t>26/05/2026</w:t>
             </w:r>
           </w:p>
         </w:tc>
@@ -11265,7 +11289,7 @@
                 <w:color w:val="202020"/>
                 <w:sz w:val="17"/>
               </w:rPr>
-              <w:t>#ILL</w:t>
+              <w:t>BUG_resa_terminale</w:t>
             </w:r>
           </w:p>
         </w:tc>
@@ -11282,7 +11306,7 @@
                 <w:color w:val="202020"/>
                 <w:sz w:val="17"/>
               </w:rPr>
-              <w:t>Chantier PEB — 5/6 sous-travaux livrés</w:t>
+              <w:t>Réservation terminale classée active</w:t>
             </w:r>
           </w:p>
         </w:tc>
@@ -11299,7 +11323,7 @@
                 <w:color w:val="202020"/>
                 <w:sz w:val="17"/>
               </w:rPr>
-              <w:t>Livré — cycle de prêt, sécurité RPC, calcul retard, archivage, comptes-rendus enrichis.</w:t>
+              <w:t>Corrigé — migration 20260526010000.</w:t>
             </w:r>
           </w:p>
         </w:tc>
@@ -11318,7 +11342,7 @@
                 <w:color w:val="202020"/>
                 <w:sz w:val="17"/>
               </w:rPr>
-              <w:t>24/05/2026</w:t>
+              <w:t>24-25/05/2026</w:t>
             </w:r>
           </w:p>
         </w:tc>
@@ -11335,7 +11359,7 @@
                 <w:color w:val="202020"/>
                 <w:sz w:val="17"/>
               </w:rPr>
-              <w:t>#TASKS</w:t>
+              <w:t>#PARTNERS</w:t>
             </w:r>
           </w:p>
         </w:tc>
@@ -11352,7 +11376,7 @@
                 <w:color w:val="202020"/>
                 <w:sz w:val="17"/>
               </w:rPr>
-              <w:t>Module des tâches de la bibliothèque</w:t>
+              <w:t>Partenaires de correspondance d'une bibliothèque</w:t>
             </w:r>
           </w:p>
         </w:tc>
@@ -11369,7 +11393,7 @@
                 <w:color w:val="202020"/>
                 <w:sz w:val="17"/>
               </w:rPr>
-              <w:t>Livré — étapes 1-6 + 3-bis, modèles récurrents + catalogue de suggestions.</w:t>
+              <w:t>Livré — migration 20260524120000, composant LibraryPartnershipsSection, 18 clés × 8 langues.</w:t>
             </w:r>
           </w:p>
         </w:tc>
@@ -11388,7 +11412,7 @@
                 <w:color w:val="202020"/>
                 <w:sz w:val="17"/>
               </w:rPr>
-              <w:t>18/05/2026</w:t>
+              <w:t>22-25/05/2026</w:t>
             </w:r>
           </w:p>
         </w:tc>
@@ -11405,7 +11429,7 @@
                 <w:color w:val="202020"/>
                 <w:sz w:val="17"/>
               </w:rPr>
-              <w:t>#153.B</w:t>
+              <w:t>#ILL</w:t>
             </w:r>
           </w:p>
         </w:tc>
@@ -11422,7 +11446,7 @@
                 <w:color w:val="202020"/>
                 <w:sz w:val="17"/>
               </w:rPr>
-              <w:t>Internationalisation des mails internes</w:t>
+              <w:t>Chantier PEB — 5/6 sous-travaux livrés</w:t>
             </w:r>
           </w:p>
         </w:tc>
@@ -11439,7 +11463,7 @@
                 <w:color w:val="202020"/>
                 <w:sz w:val="17"/>
               </w:rPr>
-              <w:t>Bouclé — signature_short_i18n jsonb, 58 patches sur 8 handlers.</w:t>
+              <w:t>Livré — cycle de prêt, sécurité RPC, calcul retard, archivage, comptes-rendus enrichis.</w:t>
             </w:r>
           </w:p>
         </w:tc>
@@ -11458,7 +11482,7 @@
                 <w:color w:val="202020"/>
                 <w:sz w:val="17"/>
               </w:rPr>
-              <w:t>18/05/2026</w:t>
+              <w:t>24/05/2026</w:t>
             </w:r>
           </w:p>
         </w:tc>
@@ -11475,7 +11499,7 @@
                 <w:color w:val="202020"/>
                 <w:sz w:val="17"/>
               </w:rPr>
-              <w:t>#150</w:t>
+              <w:t>#TASKS</w:t>
             </w:r>
           </w:p>
         </w:tc>
@@ -11492,7 +11516,7 @@
                 <w:color w:val="202020"/>
                 <w:sz w:val="17"/>
               </w:rPr>
-              <w:t>Audit sécurité — isolation 28 fonctions Cat 3</w:t>
+              <w:t>Module des tâches de la bibliothèque</w:t>
             </w:r>
           </w:p>
         </w:tc>
@@ -11509,7 +11533,7 @@
                 <w:color w:val="202020"/>
                 <w:sz w:val="17"/>
               </w:rPr>
-              <w:t>Clos — REVOKE étendu, doctrine création objets sécurisés v2, hook pre-commit en place.</w:t>
+              <w:t>Livré — étapes 1-6 + 3-bis, modèles récurrents + catalogue de suggestions.</w:t>
             </w:r>
           </w:p>
         </w:tc>
@@ -11528,7 +11552,7 @@
                 <w:color w:val="202020"/>
                 <w:sz w:val="17"/>
               </w:rPr>
-              <w:t>12-17/05/2026</w:t>
+              <w:t>18/05/2026</w:t>
             </w:r>
           </w:p>
         </w:tc>
@@ -11545,7 +11569,7 @@
                 <w:color w:val="202020"/>
                 <w:sz w:val="17"/>
               </w:rPr>
-              <w:t>#98</w:t>
+              <w:t>#153.B</w:t>
             </w:r>
           </w:p>
         </w:tc>
@@ -11562,7 +11586,7 @@
                 <w:color w:val="202020"/>
                 <w:sz w:val="17"/>
               </w:rPr>
-              <w:t>Chantier profils d'adoption (4 axes orthogonaux)</w:t>
+              <w:t>Internationalisation des mails internes</w:t>
             </w:r>
           </w:p>
         </w:tc>
@@ -11579,7 +11603,7 @@
                 <w:color w:val="202020"/>
                 <w:sz w:val="17"/>
               </w:rPr>
-              <w:t>Clos en marathon nocturne — 8 jours, ≈ 30h, 11 migrations, 4 hotfix, 672 strings i18n × 6 locales.</w:t>
+              <w:t>Bouclé — signature_short_i18n jsonb, 58 patches sur 8 handlers.</w:t>
             </w:r>
           </w:p>
         </w:tc>
@@ -11598,7 +11622,7 @@
                 <w:color w:val="202020"/>
                 <w:sz w:val="17"/>
               </w:rPr>
-              <w:t>12-13/05/2026</w:t>
+              <w:t>18/05/2026</w:t>
             </w:r>
           </w:p>
         </w:tc>
@@ -11615,7 +11639,7 @@
                 <w:color w:val="202020"/>
                 <w:sz w:val="17"/>
               </w:rPr>
-              <w:t>#K1</w:t>
+              <w:t>#150</w:t>
             </w:r>
           </w:p>
         </w:tc>
@@ -11632,7 +11656,7 @@
                 <w:color w:val="202020"/>
                 <w:sz w:val="17"/>
               </w:rPr>
-              <w:t>Spec criar-conta v0.3 (P1-P8)</w:t>
+              <w:t>Audit sécurité — isolation 28 fonctions Cat 3</w:t>
             </w:r>
           </w:p>
         </w:tc>
@@ -11649,7 +11673,7 @@
                 <w:color w:val="202020"/>
                 <w:sz w:val="17"/>
               </w:rPr>
-              <w:t>Livré — 3 cas distincts + bandeau vitrine.</w:t>
+              <w:t>Clos — REVOKE étendu, doctrine création objets sécurisés v2, hook pre-commit en place.</w:t>
             </w:r>
           </w:p>
         </w:tc>
@@ -11668,7 +11692,7 @@
                 <w:color w:val="202020"/>
                 <w:sz w:val="17"/>
               </w:rPr>
-              <w:t>11-12/05/2026</w:t>
+              <w:t>12-17/05/2026</w:t>
             </w:r>
           </w:p>
         </w:tc>
@@ -11685,7 +11709,7 @@
                 <w:color w:val="202020"/>
                 <w:sz w:val="17"/>
               </w:rPr>
-              <w:t>#L.*</w:t>
+              <w:t>#98</w:t>
             </w:r>
           </w:p>
         </w:tc>
@@ -11702,7 +11726,7 @@
                 <w:color w:val="202020"/>
                 <w:sz w:val="17"/>
               </w:rPr>
-              <w:t>Chantier linter — ≈ 90 alertes éradiquées</w:t>
+              <w:t>Chantier profils d'adoption (4 axes orthogonaux)</w:t>
             </w:r>
           </w:p>
         </w:tc>
@@ -11719,7 +11743,7 @@
                 <w:color w:val="202020"/>
                 <w:sz w:val="17"/>
               </w:rPr>
-              <w:t>Clos — 13 paquets. Doctrine création d'objets sécurisés Partie I.</w:t>
+              <w:t>Clos en marathon nocturne — 8 jours, ≈ 30h, 11 migrations, 4 hotfix, 672 strings i18n × 6 locales.</w:t>
             </w:r>
           </w:p>
         </w:tc>
@@ -11738,7 +11762,7 @@
                 <w:color w:val="202020"/>
                 <w:sz w:val="17"/>
               </w:rPr>
-              <w:t>08/05/2026</w:t>
+              <w:t>12-13/05/2026</w:t>
             </w:r>
           </w:p>
         </w:tc>
@@ -11755,7 +11779,7 @@
                 <w:color w:val="202020"/>
                 <w:sz w:val="17"/>
               </w:rPr>
-              <w:t>Paquet 5b</w:t>
+              <w:t>#K1</w:t>
             </w:r>
           </w:p>
         </w:tc>
@@ -11772,7 +11796,7 @@
                 <w:color w:val="202020"/>
                 <w:sz w:val="17"/>
               </w:rPr>
-              <w:t>Refactor v3 sémantique workflow réservation</w:t>
+              <w:t>Spec criar-conta v0.3 (P1-P8)</w:t>
             </w:r>
           </w:p>
         </w:tc>
@@ -11789,7 +11813,7 @@
                 <w:color w:val="202020"/>
                 <w:sz w:val="17"/>
               </w:rPr>
-              <w:t>Clos — réf spec-refactor-v3-semantique.md (note de clôture en blockquote ajoutée 31/05 soir).</w:t>
+              <w:t>Livré — 3 cas distincts + bandeau vitrine.</w:t>
             </w:r>
           </w:p>
         </w:tc>
@@ -11808,7 +11832,7 @@
                 <w:color w:val="202020"/>
                 <w:sz w:val="17"/>
               </w:rPr>
-              <w:t>—</w:t>
+              <w:t>11-12/05/2026</w:t>
             </w:r>
           </w:p>
         </w:tc>
@@ -11825,7 +11849,7 @@
                 <w:color w:val="202020"/>
                 <w:sz w:val="17"/>
               </w:rPr>
-              <w:t>#157</w:t>
+              <w:t>#L.*</w:t>
             </w:r>
           </w:p>
         </w:tc>
@@ -11842,7 +11866,7 @@
                 <w:color w:val="202020"/>
                 <w:sz w:val="17"/>
               </w:rPr>
-              <w:t>Gestion réservation côté conta</w:t>
+              <w:t>Chantier linter — ≈ 90 alertes éradiquées</w:t>
             </w:r>
           </w:p>
         </w:tc>
@@ -11859,7 +11883,7 @@
                 <w:color w:val="202020"/>
                 <w:sz w:val="17"/>
               </w:rPr>
-              <w:t>Absorbé par #CL.2 (livré). Sort du tableau.</w:t>
+              <w:t>Clos — 13 paquets. Doctrine création d'objets sécurisés Partie I.</w:t>
             </w:r>
           </w:p>
         </w:tc>
@@ -11878,7 +11902,7 @@
                 <w:color w:val="202020"/>
                 <w:sz w:val="17"/>
               </w:rPr>
-              <w:t>—</w:t>
+              <w:t>08/05/2026</w:t>
             </w:r>
           </w:p>
         </w:tc>
@@ -11895,7 +11919,7 @@
                 <w:color w:val="202020"/>
                 <w:sz w:val="17"/>
               </w:rPr>
-              <w:t>#H</w:t>
+              <w:t>Paquet 5b</w:t>
             </w:r>
           </w:p>
         </w:tc>
@@ -11912,7 +11936,7 @@
                 <w:color w:val="202020"/>
                 <w:sz w:val="17"/>
               </w:rPr>
-              <w:t>Scanner ISBN mobile</w:t>
+              <w:t>Refactor v3 sémantique workflow réservation</w:t>
             </w:r>
           </w:p>
         </w:tc>
@@ -11929,7 +11953,7 @@
                 <w:color w:val="202020"/>
                 <w:sz w:val="17"/>
               </w:rPr>
-              <w:t>Absorbé par #MOBILE Paquet P2.</w:t>
+              <w:t>Clos — réf spec-refactor-v3-semantique.md (note de clôture en blockquote ajoutée 31/05 soir).</w:t>
             </w:r>
           </w:p>
         </w:tc>
@@ -11965,7 +11989,7 @@
                 <w:color w:val="202020"/>
                 <w:sz w:val="17"/>
               </w:rPr>
-              <w:t>#J</w:t>
+              <w:t>#157</w:t>
             </w:r>
           </w:p>
         </w:tc>
@@ -11982,7 +12006,7 @@
                 <w:color w:val="202020"/>
                 <w:sz w:val="17"/>
               </w:rPr>
-              <w:t>Granularité loanable par exemplaire</w:t>
+              <w:t>Gestion réservation côté conta</w:t>
             </w:r>
           </w:p>
         </w:tc>
@@ -11999,7 +12023,7 @@
                 <w:color w:val="202020"/>
                 <w:sz w:val="17"/>
               </w:rPr>
-              <w:t>Fusionné dans #MODEL-item-grain.</w:t>
+              <w:t>Absorbé par #CL.2 (livré). Sort du tableau.</w:t>
             </w:r>
           </w:p>
         </w:tc>
@@ -12035,7 +12059,7 @@
                 <w:color w:val="202020"/>
                 <w:sz w:val="17"/>
               </w:rPr>
-              <w:t>#BG5</w:t>
+              <w:t>#H</w:t>
             </w:r>
           </w:p>
         </w:tc>
@@ -12052,7 +12076,7 @@
                 <w:color w:val="202020"/>
                 <w:sz w:val="17"/>
               </w:rPr>
-              <w:t>OAuth GAFAM</w:t>
+              <w:t>Scanner ISBN mobile</w:t>
             </w:r>
           </w:p>
         </w:tc>
@@ -12069,7 +12093,7 @@
                 <w:color w:val="202020"/>
                 <w:sz w:val="17"/>
               </w:rPr>
-              <w:t>Acté — choix politique de non-implémentation. 0 j-h.</w:t>
+              <w:t>Absorbé par #MOBILE Paquet P2.</w:t>
             </w:r>
           </w:p>
         </w:tc>
@@ -12088,6 +12112,146 @@
                 <w:color w:val="202020"/>
                 <w:sz w:val="17"/>
               </w:rPr>
+              <w:t>—</w:t>
+            </w:r>
+          </w:p>
+        </w:tc>
+        <w:tc>
+          <w:tcPr>
+            <w:tcW w:type="dxa" w:w="1984"/>
+            <w:vAlign w:val="top"/>
+          </w:tcPr>
+          <w:p>
+            <w:r/>
+            <w:r>
+              <w:rPr>
+                <w:rFonts w:ascii="Calibri" w:hAnsi="Calibri"/>
+                <w:color w:val="202020"/>
+                <w:sz w:val="17"/>
+              </w:rPr>
+              <w:t>#J</w:t>
+            </w:r>
+          </w:p>
+        </w:tc>
+        <w:tc>
+          <w:tcPr>
+            <w:tcW w:type="dxa" w:w="2154"/>
+            <w:vAlign w:val="top"/>
+          </w:tcPr>
+          <w:p>
+            <w:r/>
+            <w:r>
+              <w:rPr>
+                <w:rFonts w:ascii="Calibri" w:hAnsi="Calibri"/>
+                <w:color w:val="202020"/>
+                <w:sz w:val="17"/>
+              </w:rPr>
+              <w:t>Granularité loanable par exemplaire</w:t>
+            </w:r>
+          </w:p>
+        </w:tc>
+        <w:tc>
+          <w:tcPr>
+            <w:tcW w:type="dxa" w:w="4252"/>
+            <w:vAlign w:val="top"/>
+          </w:tcPr>
+          <w:p>
+            <w:r/>
+            <w:r>
+              <w:rPr>
+                <w:rFonts w:ascii="Calibri" w:hAnsi="Calibri"/>
+                <w:color w:val="202020"/>
+                <w:sz w:val="17"/>
+              </w:rPr>
+              <w:t>Fusionné dans #MODEL-item-grain.</w:t>
+            </w:r>
+          </w:p>
+        </w:tc>
+      </w:tr>
+      <w:tr>
+        <w:tc>
+          <w:tcPr>
+            <w:tcW w:type="dxa" w:w="1361"/>
+            <w:vAlign w:val="top"/>
+          </w:tcPr>
+          <w:p>
+            <w:r/>
+            <w:r>
+              <w:rPr>
+                <w:rFonts w:ascii="Calibri" w:hAnsi="Calibri"/>
+                <w:color w:val="202020"/>
+                <w:sz w:val="17"/>
+              </w:rPr>
+              <w:t>—</w:t>
+            </w:r>
+          </w:p>
+        </w:tc>
+        <w:tc>
+          <w:tcPr>
+            <w:tcW w:type="dxa" w:w="1984"/>
+            <w:vAlign w:val="top"/>
+          </w:tcPr>
+          <w:p>
+            <w:r/>
+            <w:r>
+              <w:rPr>
+                <w:rFonts w:ascii="Calibri" w:hAnsi="Calibri"/>
+                <w:color w:val="202020"/>
+                <w:sz w:val="17"/>
+              </w:rPr>
+              <w:t>#BG5</w:t>
+            </w:r>
+          </w:p>
+        </w:tc>
+        <w:tc>
+          <w:tcPr>
+            <w:tcW w:type="dxa" w:w="2154"/>
+            <w:vAlign w:val="top"/>
+          </w:tcPr>
+          <w:p>
+            <w:r/>
+            <w:r>
+              <w:rPr>
+                <w:rFonts w:ascii="Calibri" w:hAnsi="Calibri"/>
+                <w:color w:val="202020"/>
+                <w:sz w:val="17"/>
+              </w:rPr>
+              <w:t>OAuth GAFAM</w:t>
+            </w:r>
+          </w:p>
+        </w:tc>
+        <w:tc>
+          <w:tcPr>
+            <w:tcW w:type="dxa" w:w="4252"/>
+            <w:vAlign w:val="top"/>
+          </w:tcPr>
+          <w:p>
+            <w:r/>
+            <w:r>
+              <w:rPr>
+                <w:rFonts w:ascii="Calibri" w:hAnsi="Calibri"/>
+                <w:color w:val="202020"/>
+                <w:sz w:val="17"/>
+              </w:rPr>
+              <w:t>Acté — choix politique de non-implémentation. 0 j-h.</w:t>
+            </w:r>
+          </w:p>
+        </w:tc>
+      </w:tr>
+      <w:tr>
+        <w:tc>
+          <w:tcPr>
+            <w:tcW w:type="dxa" w:w="1361"/>
+            <w:vAlign w:val="top"/>
+          </w:tcPr>
+          <w:p>
+            <w:r/>
+            <w:r>
+              <w:rPr>
+                <w:rFonts w:ascii="Calibri" w:hAnsi="Calibri"/>
+                <w:color w:val="202020"/>
+                <w:sz w:val="17"/>
+              </w:rPr>
               <w:t>partiel 28/05</w:t>
             </w:r>
           </w:p>
@@ -12139,7 +12303,7 @@
                 <w:color w:val="202020"/>
                 <w:sz w:val="17"/>
               </w:rPr>
-              <w:t>Recensement et fichiers CSV/GeoJSON livrés (105 lieux, 24 pays). Reste mise en ligne uMap.</w:t>
+              <w:t>Recensement et fichiers CSV/GeoJSON livrés (105 lieux, 24 pays). Bucket de stockage carte_rede provisionné en production (migration create_bucket_carte_rede, déployée via Woodpecker #843, 2-3 juin). Reste la mise en ligne uMap.</w:t>
             </w:r>
           </w:p>
         </w:tc>
@@ -12993,7 +13157,7 @@
           <w:color w:val="445577"/>
           <w:sz w:val="20"/>
         </w:rPr>
-        <w:t>Fin du backlog v26. Session 02/06 : gouvernance du corpus — charte adoptée, registre des décisions enrichi (sections MULTI, PARTNER et règles VALID-β1/γ1), charpente spec-multi-appartenance-lecteur figée v0.3 (audit Zone 23 intégré), cadrage partenariat stabilisé arbitré puis charpente figée v0.3 (D1-D9 sous mandat collectif), partage numérique #ILL-digital arbitré (ILL-1..9, mandat BLMF) et charpenté v0.2, trois cadrages tamponnés historiques, INDEX et INVENTAIRE mis à jour. Le déploiement reste suspendu au déblocage Codeberg (HTTP 504) ; le code est en sécurité (local + GitHub). La trace est complète.</w:t>
+        <w:t>Fin du backlog v26. Session 02/06 : gouvernance du corpus — charte adoptée, registre des décisions enrichi (sections MULTI, PARTNER et règles VALID-β1/γ1), charpente spec-multi-appartenance-lecteur figée v0.3 (audit Zone 23 intégré), cadrage partenariat stabilisé arbitré puis charpente figée v0.3 (D1-D9 sous mandat collectif), partage numérique #ILL-digital arbitré (ILL-1..9, mandat BLMF) et charpenté v0.2, trois cadrages tamponnés historiques, INDEX et INVENTAIRE mis à jour. Le déploiement est effectué : Codeberg revenu après l'incident #2596, Woodpecker #843 vert (migrations, Edge Functions, pages) ; #CL.8 clos après validation runtime C.5/C.6, et le refactor i18n (lazy-load des locales) déployé. Local, GitHub, Codeberg et la prod sont alignés. La trace est complète.</w:t>
       </w:r>
     </w:p>
     <w:sectPr>

</xml_diff>

<commit_message>
backlog v26: #CARTE gamma en cours (backend resolve) + acquis 03/06 (carte-lecteur + dette ponctuelle)
</commit_message>
<xml_diff>
--- a/docs/backlogs/AnarBib-Backlog-2026-06-02-v26.docx
+++ b/docs/backlogs/AnarBib-Backlog-2026-06-02-v26.docx
@@ -3729,7 +3729,7 @@
                 <w:color w:val="202020"/>
                 <w:sz w:val="19"/>
               </w:rPr>
-              <w:t>Carte-lecteur — résolution staff (phase γ)</w:t>
+              <w:t>Carte-lecteur — résolution staff (phase γ) · backend resolve + spec v0.2 livrés 03/06</w:t>
             </w:r>
           </w:p>
         </w:tc>
@@ -3780,7 +3780,7 @@
                 <w:color w:val="202020"/>
                 <w:sz w:val="19"/>
               </w:rPr>
-              <w:t>🔵 PERSPECTIVE</w:t>
+              <w:t>🟠 EN COURS</w:t>
             </w:r>
           </w:p>
         </w:tc>
@@ -8944,6 +8944,76 @@
                 <w:sz w:val="21"/>
               </w:rPr>
               <w:t>Mode de clôture</w:t>
+            </w:r>
+          </w:p>
+        </w:tc>
+      </w:tr>
+      <w:tr>
+        <w:tc>
+          <w:tcPr>
+            <w:tcW w:type="dxa" w:w="1361"/>
+            <w:vAlign w:val="top"/>
+          </w:tcPr>
+          <w:p>
+            <w:r/>
+            <w:r>
+              <w:rPr>
+                <w:rFonts w:ascii="Calibri" w:hAnsi="Calibri"/>
+                <w:color w:val="202020"/>
+                <w:sz w:val="17"/>
+              </w:rPr>
+              <w:t>03/06/2026</w:t>
+            </w:r>
+          </w:p>
+        </w:tc>
+        <w:tc>
+          <w:tcPr>
+            <w:tcW w:type="dxa" w:w="1984"/>
+            <w:vAlign w:val="top"/>
+          </w:tcPr>
+          <w:p>
+            <w:r/>
+            <w:r>
+              <w:rPr>
+                <w:rFonts w:ascii="Calibri" w:hAnsi="Calibri"/>
+                <w:color w:val="202020"/>
+                <w:sz w:val="17"/>
+              </w:rPr>
+              <w:t>#CARTE γ + dette ponctuelle</w:t>
+            </w:r>
+          </w:p>
+        </w:tc>
+        <w:tc>
+          <w:tcPr>
+            <w:tcW w:type="dxa" w:w="2154"/>
+            <w:vAlign w:val="top"/>
+          </w:tcPr>
+          <w:p>
+            <w:r/>
+            <w:r>
+              <w:rPr>
+                <w:rFonts w:ascii="Calibri" w:hAnsi="Calibri"/>
+                <w:color w:val="202020"/>
+                <w:sz w:val="17"/>
+              </w:rPr>
+              <w:t>Résolution staff carte-lecteur (backend) + hygiène backend</w:t>
+            </w:r>
+          </w:p>
+        </w:tc>
+        <w:tc>
+          <w:tcPr>
+            <w:tcW w:type="dxa" w:w="4252"/>
+            <w:vAlign w:val="top"/>
+          </w:tcPr>
+          <w:p>
+            <w:r/>
+            <w:r>
+              <w:rPr>
+                <w:rFonts w:ascii="Calibri" w:hAnsi="Calibri"/>
+                <w:color w:val="202020"/>
+                <w:sz w:val="17"/>
+              </w:rPr>
+              <w:t>Livré — backend api.resolve_reader_card (DEFINER, garde staff librarian/coordenador + RLS, REVOKE doctrinal) + spec-carte-lecteur v0.2 (3 contrats RPC, arbitrages A.1-A.4, registre §22 CARD) ; #CARTE γ passe en cours, reste l'UI staff. Dette ponctuelle hygiène : verrou EXECUTE get_accessible_digital_asset_by_id_v2 (DOC-OBJ-2) ; USER-EMAIL-1 — profiles.email rendu miroir synchronisé de auth.users.email (trigger on_auth_user_email_changed + réconciliation des divergences ; registre §0). Deux pipelines Woodpecker verts.</w:t>
             </w:r>
           </w:p>
         </w:tc>

</xml_diff>